<commit_message>
docs: add documentation drift checks and regenerate guides
</commit_message>
<xml_diff>
--- a/documentation/Manuscript_Update_Brief.docx
+++ b/documentation/Manuscript_Update_Brief.docx
@@ -199,7 +199,7 @@
         <w:pStyle w:val="ListBullet"/>
       </w:pPr>
       <w:r>
-        <w:t>IMPORTANT — faculty availability wording: the solver restricts faculty by their available DAYS; the section's preferred start/end window is the enforced time window. Do not write "no scheduling outside declared hours" — the code does not enforce hourly availability.</w:t>
+        <w:t>IMPORTANT — faculty availability wording: faculty availability is defined by declared days **and time windows**. The solver restricts faculty to their available days and only places a session that fits within a declared window on that day; the section's preferred start/end window also applies. Write it accurately: "no scheduling on unavailable days or outside declared hours."</w:t>
       </w:r>
     </w:p>
     <w:p>
@@ -215,7 +215,7 @@
         <w:pStyle w:val="ListBullet"/>
       </w:pPr>
       <w:r>
-        <w:t>Results: OPTIMAL (all placed, optimality proven) / FEASIBLE (valid, optimality unproven) / PARTIAL (some placed, with reasons: no suitable room, no qualified faculty, window too short, capacity/type limits, other conflicts) / INFEASIBLE (none placed).</w:t>
+        <w:t>Results: OPTIMAL (all placed, optimality proven) / FEASIBLE (all placed, optimality unproven — accepted exactly like OPTIMAL) / PARTIAL (some placed, with reasons: no suitable room, no qualified faculty, window too short, capacity/type limits, other conflicts) / INFEASIBLE (none placed).</w:t>
       </w:r>
     </w:p>
     <w:p>
@@ -271,7 +271,7 @@
         <w:pStyle w:val="Heading1"/>
       </w:pPr>
       <w:r>
-        <w:t>6. THREE protection layers (new section — strong defense material)</w:t>
+        <w:t>6. FOUR protection layers (new section — strong defense material)</w:t>
       </w:r>
     </w:p>
     <w:p>
@@ -300,6 +300,14 @@
     </w:p>
     <w:p>
       <w:pPr>
+        <w:pStyle w:val="ListNumber"/>
+      </w:pPr>
+      <w:r>
+        <w:t>Published-reference delete guard — deleting a faculty member, subject, room, or section still used by a published schedule is refused with HTTP 409 unless confirmed with `?force=1`</w:t>
+      </w:r>
+    </w:p>
+    <w:p>
+      <w:pPr>
         <w:pStyle w:val="Heading1"/>
       </w:pPr>
       <w:r>
@@ -309,6 +317,11 @@
     <w:p>
       <w:r>
         <w:t>Current (use these): /api/reports/faculty-workload, /api/reports/room-utilization, /api/reports/conflicts, /api/reports/schedule-status, /api/reports/section-summary.</w:t>
+      </w:r>
+    </w:p>
+    <w:p>
+      <w:r>
+        <w:t>Note: `/api/reports/conflicts` is misnamed — it returns schedule *generation logs*, not conflicts. The Reports UI tab consuming it is labelled "Generation Logs". Do not describe it as a conflict scan.</w:t>
       </w:r>
     </w:p>
     <w:p>
@@ -329,7 +342,7 @@
         <w:pStyle w:val="ListBullet"/>
       </w:pPr>
       <w:r>
-        <w:t>Replace any "18/18 manual tests" claim with the automated suite: 6/6 backend feature tests (30 assertions) including section/year-level generation tests (schedule attributed to correct section, year level, semester; other sections untouched; regeneration archives only the target's drafts), run on an isolated scheduling_system_testing database.</w:t>
+        <w:t>Replace any "18/18 manual tests" claim with the automated suite: 114 backend feature tests (475 assertions) including section/year-level generation tests, the subject-validation rule tests (subject–section year/semester integrity, subject lab consistency), solver-status acceptance (a fully-placed `FEASIBLE` result is accepted, `INFEASIBLE` is rejected) and the unreachable-engine 502 path, run on an isolated scheduling_system_testing database, plus 53 AI-engine unit tests (Python stdlib unittest) that exercise the CP-SAT solver directly — 53 tests OK, 0 failed, 0 skipped, 0 warnings/errors.</w:t>
       </w:r>
     </w:p>
     <w:p>
@@ -444,6 +457,34 @@
                 <w:sz w:val="20"/>
               </w:rPr>
               <w:t>Authoritative architecture, flows, ERD</w:t>
+            </w:r>
+          </w:p>
+        </w:tc>
+      </w:tr>
+      <w:tr>
+        <w:tc>
+          <w:tcPr>
+            <w:tcW w:type="dxa" w:w="4320"/>
+          </w:tcPr>
+          <w:p>
+            <w:r>
+              <w:rPr>
+                <w:sz w:val="20"/>
+              </w:rPr>
+              <w:t>documentation/Program-Flow.md</w:t>
+            </w:r>
+          </w:p>
+        </w:tc>
+        <w:tc>
+          <w:tcPr>
+            <w:tcW w:type="dxa" w:w="4320"/>
+          </w:tcPr>
+          <w:p>
+            <w:r>
+              <w:rPr>
+                <w:sz w:val="20"/>
+              </w:rPr>
+              <w:t>Program-level execution: entry points and control flow, request lifecycle, per-process flows, validation-gate placement, status handling, file/function index</w:t>
             </w:r>
           </w:p>
         </w:tc>
@@ -588,6 +629,34 @@
           </w:p>
         </w:tc>
       </w:tr>
+      <w:tr>
+        <w:tc>
+          <w:tcPr>
+            <w:tcW w:type="dxa" w:w="4320"/>
+          </w:tcPr>
+          <w:p>
+            <w:r>
+              <w:rPr>
+                <w:sz w:val="20"/>
+              </w:rPr>
+              <w:t>documentation/screenshots/program-flow.mmd</w:t>
+            </w:r>
+          </w:p>
+        </w:tc>
+        <w:tc>
+          <w:tcPr>
+            <w:tcW w:type="dxa" w:w="4320"/>
+          </w:tcPr>
+          <w:p>
+            <w:r>
+              <w:rPr>
+                <w:sz w:val="20"/>
+              </w:rPr>
+              <w:t>Source of the rendered program-flow figure (11-program-flow.png)</w:t>
+            </w:r>
+          </w:p>
+        </w:tc>
+      </w:tr>
     </w:tbl>
     <w:p>
       <w:pPr>
@@ -675,6 +744,14 @@
       </w:pPr>
       <w:r>
         <w:t>Two-type room list (lecture/computer_lab only)</w:t>
+      </w:r>
+    </w:p>
+    <w:p>
+      <w:pPr>
+        <w:pStyle w:val="ListBullet"/>
+      </w:pPr>
+      <w:r>
+        <w:t>Any claim that subject assignment lacks year/semester validation or that lab subjects need no lab room type — both are now enforced server-side (HTTP 422) and documented as FR-018/FR-019</w:t>
       </w:r>
     </w:p>
     <w:p>

</xml_diff>